<commit_message>
IP-Insolvenzakten: Hauptschuld und Sicherheiten lückenlos belegen (#612)
* feat(testakten): belege Hauptschuld und IP-Sicherheiten

* fix(testakten): halte Kreditbelege zeitlich konsistent

* fix(testakten): ergänze Download-Navigation
</commit_message>
<xml_diff>
--- a/testakten/filmrechte-sicherungsuebertragung-insolvenz-schwetzingen/01_Mandat/02_Interne_Fallnotiz_Bank.docx
+++ b/testakten/filmrechte-sicherungsuebertragung-insolvenz-schwetzingen/01_Mandat/02_Interne_Fallnotiz_Bank.docx
@@ -44,7 +44,18 @@
     </w:p>
     <w:p>
       <w:r>
-        <w:t>Die Bank stellte 2024 eine Produktionslinie über 1.850.000 EUR und 2025 eine Fertigstellungstranche über 420.000 EUR bereit. Der Saldo laut Kreditbuch beträgt zum 30. September 2026 einschließlich Zinsen 1.476.830,44 EUR.</w:t>
+        <w:t>Die Bank stellte 2024 eine Produktionslinie über 1.850.000 EUR und 2025 eine zusätzliche Fertigstellungstranche über 420.000 EUR bereit. Aus der Produktionslinie wurden 1.730.000 EUR, aus der Fertigstellungstranche 420.000 EUR valutiert. Nach Kapitalrückführungen von insgesamt 710.000 EUR verbleibt ein Kapitalbetrag von 1.440.000 EUR.</w:t>
+      </w:r>
+    </w:p>
+    <w:p>
+      <w:r>
+        <w:rPr>
+          <w:b/>
+        </w:rPr>
+        <w:t>Der abgestimmte Saldo zum 22. Oktober 2026, 07:</w:t>
+      </w:r>
+      <w:r>
+        <w:t>00 Uhr, beträgt einschließlich 36.830,44 EUR offener Zinsen und Gebühren 1.476.830,44 EUR. CP-Checkliste, sechs Abrufe, sechs Bankfreigaben und Auszahlungsanzeigen, Projektkontoauszug, Darlehenskonto und Saldennachweis liegen in der Finanzierungsakte.</w:t>
       </w:r>
     </w:p>
     <w:p>

</xml_diff>